<commit_message>
license gestion and versionning
</commit_message>
<xml_diff>
--- a/v2 HCC+/User-Guide-HCC-Humanitarian-Carbon-Calculator-1.docx
+++ b/v2 HCC+/User-Guide-HCC-Humanitarian-Carbon-Calculator-1.docx
@@ -1197,23 +1197,7 @@
                 <w:rFonts w:ascii="Calibri" w:hAnsi="Calibri" w:cs="Arial"/>
                 <w:lang w:val="fr-CH"/>
               </w:rPr>
-              <w:t xml:space="preserve">Registered </w:t>
-            </w:r>
-            <w:proofErr w:type="gramStart"/>
-            <w:r>
-              <w:rPr>
-                <w:rFonts w:ascii="Calibri" w:hAnsi="Calibri" w:cs="Arial"/>
-                <w:lang w:val="fr-CH"/>
-              </w:rPr>
-              <w:t>Office:</w:t>
-            </w:r>
-            <w:proofErr w:type="gramEnd"/>
-            <w:r>
-              <w:rPr>
-                <w:rFonts w:ascii="Calibri" w:hAnsi="Calibri" w:cs="Arial"/>
-                <w:lang w:val="fr-CH"/>
-              </w:rPr>
-              <w:t xml:space="preserve"> 35 rue de Miromesnil, 75008 Paris, France</w:t>
+              <w:t>Registered Office: 35 rue de Miromesnil, 75008 Paris, France</w:t>
             </w:r>
           </w:p>
           <w:p>
@@ -1362,21 +1346,7 @@
               <w:rPr>
                 <w:rFonts w:ascii="Calibri" w:hAnsi="Calibri" w:cs="Arial"/>
               </w:rPr>
-              <w:t xml:space="preserve"> </w:t>
-            </w:r>
-            <w:proofErr w:type="gramStart"/>
-            <w:r>
-              <w:rPr>
-                <w:rFonts w:ascii="Calibri" w:hAnsi="Calibri" w:cs="Arial"/>
-              </w:rPr>
-              <w:t>excludes to the fullest extent</w:t>
-            </w:r>
-            <w:proofErr w:type="gramEnd"/>
-            <w:r>
-              <w:rPr>
-                <w:rFonts w:ascii="Calibri" w:hAnsi="Calibri" w:cs="Arial"/>
-              </w:rPr>
-              <w:t xml:space="preserve"> lawfully permitted all liability whatsoever for any loss or damage howsoever arising from reliance on the contents of this report. We do not however exclude our liability (if any) for personal injury or death resulting from our negligence, for fraud or any other matter in relation to which we cannot legally exclude liability.</w:t>
+              <w:t xml:space="preserve"> excludes to the fullest extent lawfully permitted all liability whatsoever for any loss or damage howsoever arising from reliance on the contents of this report. We do not however exclude our liability (if any) for personal injury or death resulting from our negligence, for fraud or any other matter in relation to which we cannot legally exclude liability.</w:t>
             </w:r>
           </w:p>
         </w:tc>
@@ -2881,22 +2851,6 @@
     <w:p>
       <w:pPr>
         <w:jc w:val="both"/>
-        <w:rPr>
-          <w:lang w:val="en-GB"/>
-        </w:rPr>
-      </w:pPr>
-    </w:p>
-    <w:p>
-      <w:pPr>
-        <w:jc w:val="both"/>
-        <w:rPr>
-          <w:lang w:val="en-GB"/>
-        </w:rPr>
-      </w:pPr>
-    </w:p>
-    <w:p>
-      <w:pPr>
-        <w:jc w:val="both"/>
       </w:pPr>
       <w:r>
         <w:rPr>
@@ -3140,6 +3094,116 @@
     </w:p>
     <w:p>
       <w:r>
+        <w:t xml:space="preserve">Professional versions </w:t>
+      </w:r>
+      <w:proofErr w:type="spellStart"/>
+      <w:r>
+        <w:t>prior</w:t>
+      </w:r>
+      <w:proofErr w:type="spellEnd"/>
+      <w:r>
+        <w:t xml:space="preserve"> to 2.1 and </w:t>
+      </w:r>
+      <w:proofErr w:type="spellStart"/>
+      <w:r>
+        <w:t>before</w:t>
+      </w:r>
+      <w:proofErr w:type="spellEnd"/>
+      <w:r>
+        <w:t xml:space="preserve"> the maintenance </w:t>
+      </w:r>
+      <w:proofErr w:type="spellStart"/>
+      <w:r>
+        <w:t>takeover</w:t>
+      </w:r>
+      <w:proofErr w:type="spellEnd"/>
+      <w:r>
+        <w:t xml:space="preserve"> by </w:t>
+      </w:r>
+      <w:r>
+        <w:t xml:space="preserve">the </w:t>
+      </w:r>
+      <w:proofErr w:type="spellStart"/>
+      <w:r>
+        <w:t>C</w:t>
+      </w:r>
+      <w:r>
+        <w:t>limate</w:t>
+      </w:r>
+      <w:proofErr w:type="spellEnd"/>
+      <w:r>
+        <w:t xml:space="preserve"> Action Accelerator are not </w:t>
+      </w:r>
+      <w:proofErr w:type="spellStart"/>
+      <w:r>
+        <w:t>available</w:t>
+      </w:r>
+      <w:proofErr w:type="spellEnd"/>
+      <w:r>
+        <w:t xml:space="preserve"> on GitHub; </w:t>
+      </w:r>
+      <w:proofErr w:type="spellStart"/>
+      <w:r>
+        <w:t>however</w:t>
+      </w:r>
+      <w:proofErr w:type="spellEnd"/>
+      <w:r>
+        <w:t xml:space="preserve">, </w:t>
+      </w:r>
+      <w:proofErr w:type="spellStart"/>
+      <w:r>
+        <w:t>you</w:t>
+      </w:r>
+      <w:proofErr w:type="spellEnd"/>
+      <w:r>
+        <w:t xml:space="preserve"> </w:t>
+      </w:r>
+      <w:proofErr w:type="spellStart"/>
+      <w:r>
+        <w:t>may</w:t>
+      </w:r>
+      <w:proofErr w:type="spellEnd"/>
+      <w:r>
+        <w:t xml:space="preserve"> </w:t>
+      </w:r>
+      <w:proofErr w:type="spellStart"/>
+      <w:r>
+        <w:t>request</w:t>
+      </w:r>
+      <w:proofErr w:type="spellEnd"/>
+      <w:r>
+        <w:t xml:space="preserve"> </w:t>
+      </w:r>
+      <w:proofErr w:type="spellStart"/>
+      <w:r>
+        <w:t>them</w:t>
+      </w:r>
+      <w:proofErr w:type="spellEnd"/>
+      <w:r>
+        <w:t xml:space="preserve"> </w:t>
+      </w:r>
+      <w:proofErr w:type="spellStart"/>
+      <w:r>
+        <w:t>from</w:t>
+      </w:r>
+      <w:proofErr w:type="spellEnd"/>
+      <w:r>
+        <w:t xml:space="preserve"> us via email if </w:t>
+      </w:r>
+      <w:proofErr w:type="spellStart"/>
+      <w:r>
+        <w:t>needed</w:t>
+      </w:r>
+      <w:proofErr w:type="spellEnd"/>
+      <w:r>
+        <w:t>.</w:t>
+      </w:r>
+    </w:p>
+    <w:p>
+      <w:r>
+        <w:rPr>
+          <w:noProof/>
+        </w:rPr>
         <w:drawing>
           <wp:inline distT="0" distB="0" distL="0" distR="0" wp14:anchorId="728F66EB" wp14:editId="4467ACFC">
             <wp:extent cx="2063620" cy="532738"/>
@@ -3715,21 +3779,7 @@
         <w:rPr>
           <w:lang w:val="en-GB"/>
         </w:rPr>
-        <w:t xml:space="preserve">The Humanitarian Carbon Calculator + enables humanitarian organisations to calculate their carbon footprint and identify the main sources of carbon emissions, </w:t>
-      </w:r>
-      <w:proofErr w:type="gramStart"/>
-      <w:r>
-        <w:rPr>
-          <w:lang w:val="en-GB"/>
-        </w:rPr>
-        <w:t>in order to</w:t>
-      </w:r>
-      <w:proofErr w:type="gramEnd"/>
-      <w:r>
-        <w:rPr>
-          <w:lang w:val="en-GB"/>
-        </w:rPr>
-        <w:t xml:space="preserve"> implement the most effective reduction solutions for their organisation. The enhanced version can </w:t>
+        <w:t xml:space="preserve">The Humanitarian Carbon Calculator + enables humanitarian organisations to calculate their carbon footprint and identify the main sources of carbon emissions, in order to implement the most effective reduction solutions for their organisation. The enhanced version can </w:t>
       </w:r>
       <w:r>
         <w:rPr>
@@ -4949,14 +4999,7 @@
                                   <w:sz w:val="18"/>
                                   <w:szCs w:val="18"/>
                                 </w:rPr>
-                                <w:t xml:space="preserve">connected to </w:t>
-                              </w:r>
-                              <w:r>
-                                <w:rPr>
-                                  <w:sz w:val="18"/>
-                                  <w:szCs w:val="18"/>
-                                </w:rPr>
-                                <w:t>a external data visualisation like</w:t>
+                                <w:t>connected to a external data visualisation like</w:t>
                               </w:r>
                               <w:r>
                                 <w:rPr>
@@ -5123,14 +5166,7 @@
                             <w:sz w:val="18"/>
                             <w:szCs w:val="18"/>
                           </w:rPr>
-                          <w:t xml:space="preserve">connected to </w:t>
-                        </w:r>
-                        <w:r>
-                          <w:rPr>
-                            <w:sz w:val="18"/>
-                            <w:szCs w:val="18"/>
-                          </w:rPr>
-                          <w:t>a external data visualisation like</w:t>
+                          <w:t>connected to a external data visualisation like</w:t>
                         </w:r>
                         <w:r>
                           <w:rPr>
@@ -10206,29 +10242,13 @@
           <w:bCs/>
           <w:lang w:val="en-GB"/>
         </w:rPr>
-        <w:t xml:space="preserve"> Settings</w:t>
-      </w:r>
-      <w:proofErr w:type="gramStart"/>
-      <w:r>
-        <w:rPr>
-          <w:b/>
-          <w:bCs/>
-          <w:lang w:val="en-GB"/>
-        </w:rPr>
-        <w:t>…</w:t>
-      </w:r>
-      <w:r>
-        <w:rPr>
-          <w:lang w:val="en-GB"/>
-        </w:rPr>
-        <w:t xml:space="preserve"> .</w:t>
-      </w:r>
-      <w:proofErr w:type="gramEnd"/>
-      <w:r>
-        <w:rPr>
-          <w:lang w:val="en-GB"/>
-        </w:rPr>
-        <w:t xml:space="preserve"> In the Trust </w:t>
+        <w:t xml:space="preserve"> Settings…</w:t>
+      </w:r>
+      <w:r>
+        <w:rPr>
+          <w:lang w:val="en-GB"/>
+        </w:rPr>
+        <w:t xml:space="preserve"> . In the Trust </w:t>
       </w:r>
       <w:proofErr w:type="spellStart"/>
       <w:r>
@@ -12374,21 +12394,7 @@
         <w:rPr>
           <w:lang w:val="en-GB"/>
         </w:rPr>
-        <w:t xml:space="preserve"> tab between the P and HH columns according to the entity concerned and the associated emissions item. For example, you can enter here the number of litres of LPG consumed by your stationary combustion sources </w:t>
-      </w:r>
-      <w:proofErr w:type="gramStart"/>
-      <w:r>
-        <w:rPr>
-          <w:lang w:val="en-GB"/>
-        </w:rPr>
-        <w:t>in a given</w:t>
-      </w:r>
-      <w:proofErr w:type="gramEnd"/>
-      <w:r>
-        <w:rPr>
-          <w:lang w:val="en-GB"/>
-        </w:rPr>
-        <w:t xml:space="preserve"> entity, and this </w:t>
+        <w:t xml:space="preserve"> tab between the P and HH columns according to the entity concerned and the associated emissions item. For example, you can enter here the number of litres of LPG consumed by your stationary combustion sources in a given entity, and this </w:t>
       </w:r>
       <w:r>
         <w:rPr>
@@ -12691,27 +12697,13 @@
         <w:rPr>
           <w:lang w:val="en-US"/>
         </w:rPr>
-        <w:t xml:space="preserve"> whether there </w:t>
-      </w:r>
-      <w:proofErr w:type="gramStart"/>
+        <w:t xml:space="preserve"> whether there is any </w:t>
+      </w:r>
       <w:r>
         <w:rPr>
           <w:lang w:val="en-US"/>
         </w:rPr>
-        <w:t xml:space="preserve">is any </w:t>
-      </w:r>
-      <w:r>
-        <w:rPr>
-          <w:lang w:val="en-US"/>
-        </w:rPr>
-        <w:t>error</w:t>
-      </w:r>
-      <w:proofErr w:type="gramEnd"/>
-      <w:r>
-        <w:rPr>
-          <w:lang w:val="en-US"/>
-        </w:rPr>
-        <w:t>/mismatch</w:t>
+        <w:t>error/mismatch</w:t>
       </w:r>
       <w:r>
         <w:rPr>
@@ -12808,21 +12800,7 @@
         <w:rPr>
           <w:lang w:val="en-US"/>
         </w:rPr>
-        <w:t xml:space="preserve"> whether there </w:t>
-      </w:r>
-      <w:proofErr w:type="gramStart"/>
-      <w:r>
-        <w:rPr>
-          <w:lang w:val="en-US"/>
-        </w:rPr>
-        <w:t>is any error</w:t>
-      </w:r>
-      <w:proofErr w:type="gramEnd"/>
-      <w:r>
-        <w:rPr>
-          <w:lang w:val="en-US"/>
-        </w:rPr>
-        <w:t>/mismatch</w:t>
+        <w:t xml:space="preserve"> whether there is any error/mismatch</w:t>
       </w:r>
       <w:r>
         <w:rPr>
@@ -14478,13 +14456,8 @@
       <w:r>
         <w:t xml:space="preserve">selecting values “FALSE” </w:t>
       </w:r>
-      <w:proofErr w:type="gramStart"/>
-      <w:r>
-        <w:t>and  for</w:t>
-      </w:r>
-      <w:proofErr w:type="gramEnd"/>
-      <w:r>
-        <w:t xml:space="preserve"> each row </w:t>
+      <w:r>
+        <w:t xml:space="preserve">and  for each row </w:t>
       </w:r>
       <w:r>
         <w:t xml:space="preserve">you </w:t>
@@ -14899,7 +14872,6 @@
         </w:rPr>
         <w:t xml:space="preserve">1 and paste it to all the rows in column </w:t>
       </w:r>
-      <w:proofErr w:type="gramStart"/>
       <w:r>
         <w:rPr>
           <w:color w:val="FFC000"/>
@@ -14918,7 +14890,6 @@
         </w:rPr>
         <w:t>.</w:t>
       </w:r>
-      <w:proofErr w:type="gramEnd"/>
     </w:p>
     <w:p>
       <w:pPr>
@@ -17352,14 +17323,12 @@
       <w:r>
         <w:t xml:space="preserve">certainty </w:t>
       </w:r>
-      <w:proofErr w:type="gramStart"/>
       <w:r>
         <w:t>level</w:t>
       </w:r>
       <w:r>
         <w:t>(</w:t>
       </w:r>
-      <w:proofErr w:type="gramEnd"/>
       <w:r>
         <w:t>from 25% to 100%.</w:t>
       </w:r>
@@ -17602,15 +17571,7 @@
         <w:t xml:space="preserve"> </w:t>
       </w:r>
       <w:r>
-        <w:t xml:space="preserve">the overall quality score for the footprint. They are used </w:t>
-      </w:r>
-      <w:proofErr w:type="gramStart"/>
-      <w:r>
-        <w:t>in particular to</w:t>
-      </w:r>
-      <w:proofErr w:type="gramEnd"/>
-      <w:r>
-        <w:t xml:space="preserve"> define what needs to be worked on to obtain better data</w:t>
+        <w:t>the overall quality score for the footprint. They are used in particular to define what needs to be worked on to obtain better data</w:t>
       </w:r>
       <w:r>
         <w:t xml:space="preserve"> in the future</w:t>
@@ -18177,16 +18138,11 @@
         <w:t>(1</w:t>
       </w:r>
       <w:r>
-        <w:t xml:space="preserve"> screenshot </w:t>
-      </w:r>
-      <w:proofErr w:type="gramStart"/>
-      <w:r>
-        <w:t xml:space="preserve">below </w:t>
+        <w:t xml:space="preserve"> screenshot below </w:t>
       </w:r>
       <w:r>
         <w:t>)</w:t>
       </w:r>
-      <w:proofErr w:type="gramEnd"/>
       <w:r>
         <w:t xml:space="preserve"> </w:t>
       </w:r>
@@ -21184,15 +21140,7 @@
         </w:numPr>
       </w:pPr>
       <w:r>
-        <w:t xml:space="preserve">Don't hesitate to train the staff responsible for servicing and maintaining refrigeration equipment so that they are able to identify the types of </w:t>
-      </w:r>
-      <w:proofErr w:type="gramStart"/>
-      <w:r>
-        <w:t>refrigerant</w:t>
-      </w:r>
-      <w:proofErr w:type="gramEnd"/>
-      <w:r>
-        <w:t xml:space="preserve"> and determine the quantities that have leaked. </w:t>
+        <w:t xml:space="preserve">Don't hesitate to train the staff responsible for servicing and maintaining refrigeration equipment so that they are able to identify the types of refrigerant and determine the quantities that have leaked. </w:t>
       </w:r>
     </w:p>
     <w:p>
@@ -26724,7 +26672,6 @@
         </w:rPr>
         <w:t>3</w:t>
       </w:r>
-      <w:proofErr w:type="gramStart"/>
       <w:r>
         <w:rPr>
           <w:b/>
@@ -26746,25 +26693,8 @@
           <w:color w:val="C00000"/>
           <w:lang w:val="en-GB"/>
         </w:rPr>
-        <w:t>!!</w:t>
-      </w:r>
-      <w:proofErr w:type="gramEnd"/>
-      <w:r>
-        <w:rPr>
-          <w:color w:val="C00000"/>
-          <w:lang w:val="en-GB"/>
-        </w:rPr>
-        <w:t xml:space="preserve"> FOR ADVANCED USERS </w:t>
-      </w:r>
-      <w:proofErr w:type="gramStart"/>
-      <w:r>
-        <w:rPr>
-          <w:color w:val="C00000"/>
-          <w:lang w:val="en-GB"/>
-        </w:rPr>
-        <w:t>ONLY !!</w:t>
-      </w:r>
-      <w:proofErr w:type="gramEnd"/>
+        <w:t>!! FOR ADVANCED USERS ONLY !!</w:t>
+      </w:r>
     </w:p>
     <w:p>
       <w:pPr>
@@ -27769,15 +27699,7 @@
         <w:t>To calculate the level of uncertainty,</w:t>
       </w:r>
       <w:r>
-        <w:t xml:space="preserve"> the idea is to combine the uncertainty of the emission factor and the uncertainty of the input data. To do this (the uncertainties being independent of each other), we use the uncertainty propagation method to reflect the relative contribution to the total uncertainty of </w:t>
-      </w:r>
-      <w:proofErr w:type="gramStart"/>
-      <w:r>
-        <w:t>the final result</w:t>
-      </w:r>
-      <w:proofErr w:type="gramEnd"/>
-      <w:r>
-        <w:t>. (The two uncertainties are percentages.)</w:t>
+        <w:t xml:space="preserve"> the idea is to combine the uncertainty of the emission factor and the uncertainty of the input data. To do this (the uncertainties being independent of each other), we use the uncertainty propagation method to reflect the relative contribution to the total uncertainty of the final result. (The two uncertainties are percentages.)</w:t>
       </w:r>
     </w:p>
     <w:p>
@@ -27791,7 +27713,6 @@
       <w:r>
         <w:t>Combined Uncertainty = √ (</w:t>
       </w:r>
-      <w:proofErr w:type="gramStart"/>
       <w:r>
         <w:rPr>
           <w:rFonts w:ascii="Cambria Math" w:eastAsia="Cambria Math" w:hAnsi="Cambria Math" w:cs="Cambria Math" w:hint="eastAsia"/>
@@ -27799,15 +27720,7 @@
         <w:t>〖</w:t>
       </w:r>
       <w:r>
-        <w:t>(</w:t>
-      </w:r>
-      <w:proofErr w:type="gramEnd"/>
-      <w:r>
-        <w:t xml:space="preserve">EF </w:t>
-      </w:r>
-      <w:proofErr w:type="gramStart"/>
-      <w:r>
-        <w:t>Uncertainty)</w:t>
+        <w:t>(EF Uncertainty)</w:t>
       </w:r>
       <w:r>
         <w:rPr>
@@ -27815,11 +27728,9 @@
         </w:rPr>
         <w:t>〗</w:t>
       </w:r>
-      <w:proofErr w:type="gramEnd"/>
       <w:r>
         <w:t>^2 +</w:t>
       </w:r>
-      <w:proofErr w:type="gramStart"/>
       <w:r>
         <w:rPr>
           <w:rFonts w:ascii="Cambria Math" w:eastAsia="Cambria Math" w:hAnsi="Cambria Math" w:cs="Cambria Math" w:hint="eastAsia"/>
@@ -27827,15 +27738,7 @@
         <w:t>〖</w:t>
       </w:r>
       <w:r>
-        <w:t>(</w:t>
-      </w:r>
-      <w:proofErr w:type="gramEnd"/>
-      <w:r>
-        <w:t xml:space="preserve">Data </w:t>
-      </w:r>
-      <w:proofErr w:type="gramStart"/>
-      <w:r>
-        <w:t>Uncertainty)</w:t>
+        <w:t>(Data Uncertainty)</w:t>
       </w:r>
       <w:r>
         <w:rPr>
@@ -27843,15 +27746,9 @@
         </w:rPr>
         <w:t>〗</w:t>
       </w:r>
-      <w:proofErr w:type="gramEnd"/>
-      <w:r>
-        <w:t>^</w:t>
-      </w:r>
-      <w:proofErr w:type="gramStart"/>
-      <w:r>
-        <w:t>2 )</w:t>
-      </w:r>
-      <w:proofErr w:type="gramEnd"/>
+      <w:r>
+        <w:t>^2 )</w:t>
+      </w:r>
     </w:p>
     <w:p>
       <w:pPr>
@@ -28010,15 +27907,7 @@
         <w:t xml:space="preserve">: </w:t>
       </w:r>
       <w:r>
-        <w:t xml:space="preserve">a line corresponding to an emission factor </w:t>
-      </w:r>
-      <w:proofErr w:type="gramStart"/>
-      <w:r>
-        <w:t>in a given</w:t>
-      </w:r>
-      <w:proofErr w:type="gramEnd"/>
-      <w:r>
-        <w:t xml:space="preserve"> category and subcategory is not applicable to your organi</w:t>
+        <w:t>a line corresponding to an emission factor in a given category and subcategory is not applicable to your organi</w:t>
       </w:r>
       <w:r>
         <w:t>s</w:t>
@@ -28045,15 +27934,7 @@
         <w:t xml:space="preserve">: </w:t>
       </w:r>
       <w:r>
-        <w:t xml:space="preserve">a line corresponding to an emission factor </w:t>
-      </w:r>
-      <w:proofErr w:type="gramStart"/>
-      <w:r>
-        <w:t>in a given</w:t>
-      </w:r>
-      <w:proofErr w:type="gramEnd"/>
-      <w:r>
-        <w:t xml:space="preserve"> category and subcategory is applicable to your organi</w:t>
+        <w:t>a line corresponding to an emission factor in a given category and subcategory is applicable to your organi</w:t>
       </w:r>
       <w:r>
         <w:t>s</w:t>
@@ -28089,15 +27970,7 @@
         <w:t xml:space="preserve">cenario 3: </w:t>
       </w:r>
       <w:r>
-        <w:t xml:space="preserve">a line corresponding to an emission factor </w:t>
-      </w:r>
-      <w:proofErr w:type="gramStart"/>
-      <w:r>
-        <w:t>in a given</w:t>
-      </w:r>
-      <w:proofErr w:type="gramEnd"/>
-      <w:r>
-        <w:t xml:space="preserve"> category and subcategory is applicable to your organi</w:t>
+        <w:t>a line corresponding to an emission factor in a given category and subcategory is applicable to your organi</w:t>
       </w:r>
       <w:r>
         <w:t>s</w:t>
@@ -28128,15 +28001,7 @@
         <w:t xml:space="preserve">  </w:t>
       </w:r>
       <w:r>
-        <w:t xml:space="preserve">a line corresponding to an emission factor </w:t>
-      </w:r>
-      <w:proofErr w:type="gramStart"/>
-      <w:r>
-        <w:t>in a given</w:t>
-      </w:r>
-      <w:proofErr w:type="gramEnd"/>
-      <w:r>
-        <w:t xml:space="preserve"> category and subcategory is applicable to your organi</w:t>
+        <w:t>a line corresponding to an emission factor in a given category and subcategory is applicable to your organi</w:t>
       </w:r>
       <w:r>
         <w:t>sati</w:t>
@@ -28223,15 +28088,7 @@
         <w:t xml:space="preserve"> </w:t>
       </w:r>
       <w:r>
-        <w:t xml:space="preserve">a line corresponding to an emission factor </w:t>
-      </w:r>
-      <w:proofErr w:type="gramStart"/>
-      <w:r>
-        <w:t>in a given</w:t>
-      </w:r>
-      <w:proofErr w:type="gramEnd"/>
-      <w:r>
-        <w:t xml:space="preserve"> category and subcategory is applicable to your organi</w:t>
+        <w:t>a line corresponding to an emission factor in a given category and subcategory is applicable to your organi</w:t>
       </w:r>
       <w:r>
         <w:t>s</w:t>
@@ -28679,18 +28536,7 @@
                                   <w:shd w:val="clear" w:color="auto" w:fill="FFFFFF"/>
                                   <w:lang w:val="en-US"/>
                                 </w:rPr>
-                                <w:t xml:space="preserve"> to compile new emission factors that the different </w:t>
-                              </w:r>
-                              <w:r>
-                                <w:rPr>
-                                  <w:rFonts w:eastAsia="Times New Roman" w:cstheme="minorHAnsi"/>
-                                  <w:b/>
-                                  <w:bCs/>
-                                  <w:color w:val="333333"/>
-                                  <w:shd w:val="clear" w:color="auto" w:fill="FFFFFF"/>
-                                  <w:lang w:val="en-US"/>
-                                </w:rPr>
-                                <w:t>organi</w:t>
+                                <w:t xml:space="preserve"> to compile new emission factors that the different organi</w:t>
                               </w:r>
                               <w:r>
                                 <w:rPr>
@@ -28825,18 +28671,7 @@
                             <w:shd w:val="clear" w:color="auto" w:fill="FFFFFF"/>
                             <w:lang w:val="en-US"/>
                           </w:rPr>
-                          <w:t xml:space="preserve"> to compile new emission factors that the different </w:t>
-                        </w:r>
-                        <w:r>
-                          <w:rPr>
-                            <w:rFonts w:eastAsia="Times New Roman" w:cstheme="minorHAnsi"/>
-                            <w:b/>
-                            <w:bCs/>
-                            <w:color w:val="333333"/>
-                            <w:shd w:val="clear" w:color="auto" w:fill="FFFFFF"/>
-                            <w:lang w:val="en-US"/>
-                          </w:rPr>
-                          <w:t>organi</w:t>
+                          <w:t xml:space="preserve"> to compile new emission factors that the different organi</w:t>
                         </w:r>
                         <w:r>
                           <w:rPr>
@@ -32839,15 +32674,7 @@
         <w:t>s</w:t>
       </w:r>
       <w:r>
-        <w:t xml:space="preserve">pace to enter the name of the organisation that added an emissions factor, so that it can be traced if </w:t>
-      </w:r>
-      <w:proofErr w:type="gramStart"/>
-      <w:r>
-        <w:t>necessary</w:t>
-      </w:r>
-      <w:proofErr w:type="gramEnd"/>
-      <w:r>
-        <w:t xml:space="preserve"> when the database is updated.</w:t>
+        <w:t>pace to enter the name of the organisation that added an emissions factor, so that it can be traced if necessary when the database is updated.</w:t>
       </w:r>
     </w:p>
     <w:p>
@@ -34102,13 +33929,8 @@
         </w:numPr>
         <w:ind w:left="1276"/>
       </w:pPr>
-      <w:proofErr w:type="gramStart"/>
-      <w:r>
-        <w:t>First</w:t>
-      </w:r>
-      <w:proofErr w:type="gramEnd"/>
-      <w:r>
-        <w:t xml:space="preserve"> you need to find the price per kWh of electricity for the country for which you don't have the physical data. For this, several sites are reliable sources of data:</w:t>
+      <w:r>
+        <w:t>First you need to find the price per kWh of electricity for the country for which you don't have the physical data. For this, several sites are reliable sources of data:</w:t>
       </w:r>
       <w:r>
         <w:t xml:space="preserve"> </w:t>
@@ -37359,23 +37181,7 @@
         <w:t xml:space="preserve">most of the categories, </w:t>
       </w:r>
       <w:r>
-        <w:t xml:space="preserve">to simplify things for less experienced users. It turns out that for some categories, and </w:t>
-      </w:r>
-      <w:proofErr w:type="gramStart"/>
-      <w:r>
-        <w:t>in particular for</w:t>
-      </w:r>
-      <w:proofErr w:type="gramEnd"/>
-      <w:r>
-        <w:t xml:space="preserve"> energy or fugitive emissions, allocation by budget, even if it is the easiest to obtain, may not be the most relevant. The most relevant </w:t>
-      </w:r>
-      <w:proofErr w:type="gramStart"/>
-      <w:r>
-        <w:t>would be</w:t>
-      </w:r>
-      <w:proofErr w:type="gramEnd"/>
-      <w:r>
-        <w:t xml:space="preserve"> allocation by m².  As not all organisations can obtain data on the m² of each entity, we have assigned the budget as the default allocation, however this can be changed and is even better if you have information on the number of m² for each entity.</w:t>
+        <w:t>to simplify things for less experienced users. It turns out that for some categories, and in particular for energy or fugitive emissions, allocation by budget, even if it is the easiest to obtain, may not be the most relevant. The most relevant would be allocation by m².  As not all organisations can obtain data on the m² of each entity, we have assigned the budget as the default allocation, however this can be changed and is even better if you have information on the number of m² for each entity.</w:t>
       </w:r>
     </w:p>
     <w:p>
@@ -37456,18 +37262,8 @@
                 <w:bCs/>
                 <w:lang w:val="en-GB"/>
               </w:rPr>
-              <w:t xml:space="preserve">By </w:t>
-            </w:r>
-            <w:proofErr w:type="gramStart"/>
-            <w:r>
-              <w:rPr>
-                <w:b/>
-                <w:bCs/>
-                <w:lang w:val="en-GB"/>
-              </w:rPr>
-              <w:t>default</w:t>
-            </w:r>
-            <w:proofErr w:type="gramEnd"/>
+              <w:t>By default</w:t>
+            </w:r>
           </w:p>
         </w:tc>
         <w:tc>
@@ -39420,13 +39216,8 @@
           <w:szCs w:val="24"/>
         </w:rPr>
       </w:pPr>
-      <w:proofErr w:type="gramStart"/>
-      <w:r>
-        <w:t>First of all</w:t>
-      </w:r>
-      <w:proofErr w:type="gramEnd"/>
-      <w:r>
-        <w:t xml:space="preserve">, make sure you have saved a blank version of the tool so that you can go back if necessary. </w:t>
+      <w:r>
+        <w:t xml:space="preserve">First of all, make sure you have saved a blank version of the tool so that you can go back if necessary. </w:t>
       </w:r>
     </w:p>
     <w:p>
@@ -39465,7 +39256,7 @@
           <w:noProof/>
         </w:rPr>
         <w:drawing>
-          <wp:anchor distT="0" distB="0" distL="114300" distR="114300" simplePos="0" relativeHeight="251659303" behindDoc="0" locked="0" layoutInCell="1" allowOverlap="1" wp14:anchorId="696CFF55" wp14:editId="38919757">
+          <wp:anchor distT="0" distB="0" distL="114300" distR="114300" simplePos="0" relativeHeight="251659303" behindDoc="0" locked="0" layoutInCell="1" allowOverlap="1" wp14:anchorId="696CFF55" wp14:editId="37B84396">
             <wp:simplePos x="0" y="0"/>
             <wp:positionH relativeFrom="column">
               <wp:posOffset>4294911</wp:posOffset>
@@ -39733,15 +39524,7 @@
         <w:t>between the IA and XK columns must be updated.</w:t>
       </w:r>
       <w:r>
-        <w:t xml:space="preserve"> This operation therefore </w:t>
-      </w:r>
-      <w:proofErr w:type="gramStart"/>
-      <w:r>
-        <w:t>has to</w:t>
-      </w:r>
-      <w:proofErr w:type="gramEnd"/>
-      <w:r>
-        <w:t xml:space="preserve"> be repeated many times (for all 9 collection tabs!).</w:t>
+        <w:t xml:space="preserve"> This operation therefore has to be repeated many times (for all 9 collection tabs!).</w:t>
       </w:r>
     </w:p>
     <w:p>
@@ -39820,7 +39603,7 @@
           <w:lang w:val="en-GB"/>
         </w:rPr>
         <w:drawing>
-          <wp:anchor distT="0" distB="0" distL="114300" distR="114300" simplePos="0" relativeHeight="251658249" behindDoc="0" locked="0" layoutInCell="1" allowOverlap="1" wp14:anchorId="588AA274" wp14:editId="5CD027BE">
+          <wp:anchor distT="0" distB="0" distL="114300" distR="114300" simplePos="0" relativeHeight="251658249" behindDoc="0" locked="0" layoutInCell="1" allowOverlap="1" wp14:anchorId="588AA274" wp14:editId="5933EA81">
             <wp:simplePos x="0" y="0"/>
             <wp:positionH relativeFrom="column">
               <wp:posOffset>-236855</wp:posOffset>
@@ -41206,7 +40989,7 @@
           <w:lang w:val="en-GB"/>
         </w:rPr>
         <w:drawing>
-          <wp:anchor distT="0" distB="0" distL="114300" distR="114300" simplePos="0" relativeHeight="251658266" behindDoc="0" locked="0" layoutInCell="1" allowOverlap="1" wp14:anchorId="41754C4D" wp14:editId="13C08C39">
+          <wp:anchor distT="0" distB="0" distL="114300" distR="114300" simplePos="0" relativeHeight="251658266" behindDoc="0" locked="0" layoutInCell="1" allowOverlap="1" wp14:anchorId="41754C4D" wp14:editId="6B2A84C2">
             <wp:simplePos x="0" y="0"/>
             <wp:positionH relativeFrom="column">
               <wp:posOffset>-71120</wp:posOffset>
@@ -41863,23 +41646,13 @@
               </w:rPr>
               <w:t xml:space="preserve">2021 inflation rates </w:t>
             </w:r>
-            <w:proofErr w:type="gramStart"/>
             <w:r>
               <w:rPr>
                 <w:i/>
                 <w:iCs/>
                 <w:lang w:val="en-GB"/>
               </w:rPr>
-              <w:t>is</w:t>
-            </w:r>
-            <w:proofErr w:type="gramEnd"/>
-            <w:r>
-              <w:rPr>
-                <w:i/>
-                <w:iCs/>
-                <w:lang w:val="en-GB"/>
-              </w:rPr>
-              <w:t xml:space="preserve"> 3.42%</w:t>
+              <w:t>is 3.42%</w:t>
             </w:r>
           </w:p>
         </w:tc>
@@ -41900,7 +41673,7 @@
           <w:lang w:val="en-GB"/>
         </w:rPr>
         <w:drawing>
-          <wp:anchor distT="0" distB="0" distL="114300" distR="114300" simplePos="0" relativeHeight="251658262" behindDoc="0" locked="0" layoutInCell="1" allowOverlap="1" wp14:anchorId="429BD26B" wp14:editId="34BB628D">
+          <wp:anchor distT="0" distB="0" distL="114300" distR="114300" simplePos="0" relativeHeight="251658262" behindDoc="0" locked="0" layoutInCell="1" allowOverlap="1" wp14:anchorId="429BD26B" wp14:editId="59A0069C">
             <wp:simplePos x="0" y="0"/>
             <wp:positionH relativeFrom="column">
               <wp:posOffset>-71755</wp:posOffset>
@@ -43316,7 +43089,6 @@
           <w:docPartUnique/>
         </w:docPartObj>
       </w:sdtPr>
-      <w:sdtEndPr/>
       <w:sdtContent>
         <w:r>
           <w:fldChar w:fldCharType="begin"/>
@@ -50894,15 +50666,6 @@
 </file>
 
 <file path=customXml/item1.xml><?xml version="1.0" encoding="utf-8"?>
-<?mso-contentType ?>
-<FormTemplates xmlns="http://schemas.microsoft.com/sharepoint/v3/contenttype/forms">
-  <Display>DocumentLibraryForm</Display>
-  <Edit>DocumentLibraryForm</Edit>
-  <New>DocumentLibraryForm</New>
-</FormTemplates>
-</file>
-
-<file path=customXml/item2.xml><?xml version="1.0" encoding="utf-8"?>
 <p:properties xmlns:p="http://schemas.microsoft.com/office/2006/metadata/properties" xmlns:xsi="http://www.w3.org/2001/XMLSchema-instance" xmlns:pc="http://schemas.microsoft.com/office/infopath/2007/PartnerControls">
   <documentManagement>
     <TaxCatchAll xmlns="a2df02af-3501-485b-b40b-535dfdd5fb01" xsi:nil="true"/>
@@ -50913,8 +50676,17 @@
 </p:properties>
 </file>
 
+<file path=customXml/item2.xml><?xml version="1.0" encoding="utf-8"?>
+<b:Sources xmlns:b="http://schemas.openxmlformats.org/officeDocument/2006/bibliography" xmlns="http://schemas.openxmlformats.org/officeDocument/2006/bibliography" SelectedStyle="\APASixthEditionOfficeOnline.xsl" StyleName="APA" Version="6"/>
+</file>
+
 <file path=customXml/item3.xml><?xml version="1.0" encoding="utf-8"?>
-<b:Sources xmlns:b="http://schemas.openxmlformats.org/officeDocument/2006/bibliography" xmlns="http://schemas.openxmlformats.org/officeDocument/2006/bibliography" SelectedStyle="\APASixthEditionOfficeOnline.xsl" StyleName="APA" Version="6"/>
+<?mso-contentType ?>
+<FormTemplates xmlns="http://schemas.microsoft.com/sharepoint/v3/contenttype/forms">
+  <Display>DocumentLibraryForm</Display>
+  <Edit>DocumentLibraryForm</Edit>
+  <New>DocumentLibraryForm</New>
+</FormTemplates>
 </file>
 
 <file path=customXml/item4.xml><?xml version="1.0" encoding="utf-8"?>
@@ -51113,14 +50885,6 @@
 </file>
 
 <file path=customXml/itemProps1.xml><?xml version="1.0" encoding="utf-8"?>
-<ds:datastoreItem xmlns:ds="http://schemas.openxmlformats.org/officeDocument/2006/customXml" ds:itemID="{E0656F49-B7EF-41A1-BA6C-A36F3B6DC861}">
-  <ds:schemaRefs>
-    <ds:schemaRef ds:uri="http://schemas.microsoft.com/sharepoint/v3/contenttype/forms"/>
-  </ds:schemaRefs>
-</ds:datastoreItem>
-</file>
-
-<file path=customXml/itemProps2.xml><?xml version="1.0" encoding="utf-8"?>
 <ds:datastoreItem xmlns:ds="http://schemas.openxmlformats.org/officeDocument/2006/customXml" ds:itemID="{F34D112E-61EC-4B48-A984-427AD4601CFC}">
   <ds:schemaRefs>
     <ds:schemaRef ds:uri="http://schemas.microsoft.com/office/2006/metadata/properties"/>
@@ -51131,10 +50895,18 @@
 </ds:datastoreItem>
 </file>
 
-<file path=customXml/itemProps3.xml><?xml version="1.0" encoding="utf-8"?>
+<file path=customXml/itemProps2.xml><?xml version="1.0" encoding="utf-8"?>
 <ds:datastoreItem xmlns:ds="http://schemas.openxmlformats.org/officeDocument/2006/customXml" ds:itemID="{906C246F-C0F6-4D98-89AB-84E6C0EC457F}">
   <ds:schemaRefs>
     <ds:schemaRef ds:uri="http://schemas.openxmlformats.org/officeDocument/2006/bibliography"/>
+  </ds:schemaRefs>
+</ds:datastoreItem>
+</file>
+
+<file path=customXml/itemProps3.xml><?xml version="1.0" encoding="utf-8"?>
+<ds:datastoreItem xmlns:ds="http://schemas.openxmlformats.org/officeDocument/2006/customXml" ds:itemID="{E0656F49-B7EF-41A1-BA6C-A36F3B6DC861}">
+  <ds:schemaRefs>
+    <ds:schemaRef ds:uri="http://schemas.microsoft.com/sharepoint/v3/contenttype/forms"/>
   </ds:schemaRefs>
 </ds:datastoreItem>
 </file>

</xml_diff>